<commit_message>
feat(RapportDePatrouille): refactor + passengers
</commit_message>
<xml_diff>
--- a/backend/src/main/resources/template_export_rapport_patrouille_PAM.docx
+++ b/backend/src/main/resources/template_export_rapport_patrouille_PAM.docx
@@ -9087,6 +9087,16 @@
         </w:rPr>
       </w:r>
     </w:p>
+    <w:p>
+      <w:pPr>
+        <w:rPr/>
+      </w:pPr>
+      <w:r>
+        <w:rPr>
+          <w:rtl w:val="0"/>
+        </w:rPr>
+      </w:r>
+    </w:p>
     <w:tbl>
       <w:tblPr>
         <w:tblStyle w:val="Table7"/>
@@ -9164,7 +9174,20 @@
                 <w:vertAlign w:val="baseline"/>
                 <w:rtl w:val="0"/>
               </w:rPr>
-              <w:t xml:space="preserve">Nombre de stagiaires embarqués :   /</w:t>
+              <w:t xml:space="preserve">Nombre de stagiaires embarqués :   </w:t>
+            </w:r>
+            <w:r>
+              <w:rPr>
+                <w:sz w:val="20"/>
+                <w:szCs w:val="20"/>
+                <w:rtl w:val="0"/>
+              </w:rPr>
+              <w:t xml:space="preserve">${nbInterns}</w:t>
+            </w:r>
+            <w:r>
+              <w:rPr>
+                <w:rtl w:val="0"/>
+              </w:rPr>
             </w:r>
           </w:p>
           <w:p>
@@ -9212,7 +9235,20 @@
                 <w:vertAlign w:val="baseline"/>
                 <w:rtl w:val="0"/>
               </w:rPr>
-              <w:t xml:space="preserve">Affaires Maritimes :   /</w:t>
+              <w:t xml:space="preserve">Affaires Maritimes : </w:t>
+            </w:r>
+            <w:r>
+              <w:rPr>
+                <w:sz w:val="20"/>
+                <w:szCs w:val="20"/>
+                <w:rtl w:val="0"/>
+              </w:rPr>
+              <w:t xml:space="preserve">${nbAffMarInterns}</w:t>
+            </w:r>
+            <w:r>
+              <w:rPr>
+                <w:rtl w:val="0"/>
+              </w:rPr>
             </w:r>
           </w:p>
           <w:p>
@@ -9248,19 +9284,40 @@
             </w:pPr>
             <w:r>
               <w:rPr>
-                <w:i w:val="0"/>
-                <w:iCs w:val="0"/>
-                <w:smallCaps w:val="0"/>
-                <w:strike w:val="0"/>
-                <w:color w:val="000000"/>
                 <w:sz w:val="20"/>
                 <w:szCs w:val="20"/>
-                <w:u w:val="none"/>
-                <w:shd w:fill="auto" w:val="clear"/>
-                <w:vertAlign w:val="baseline"/>
-                <w:rtl w:val="0"/>
-              </w:rPr>
-              <w:t xml:space="preserve">LPM/ENSM :   /</w:t>
+                <w:rtl w:val="0"/>
+              </w:rPr>
+              <w:t xml:space="preserve">Etudes supérieures </w:t>
+            </w:r>
+            <w:r>
+              <w:rPr>
+                <w:i w:val="0"/>
+                <w:iCs w:val="0"/>
+                <w:smallCaps w:val="0"/>
+                <w:strike w:val="0"/>
+                <w:color w:val="000000"/>
+                <w:sz w:val="20"/>
+                <w:szCs w:val="20"/>
+                <w:u w:val="none"/>
+                <w:shd w:fill="auto" w:val="clear"/>
+                <w:vertAlign w:val="baseline"/>
+                <w:rtl w:val="0"/>
+              </w:rPr>
+              <w:t xml:space="preserve">: </w:t>
+            </w:r>
+            <w:r>
+              <w:rPr>
+                <w:sz w:val="20"/>
+                <w:szCs w:val="20"/>
+                <w:rtl w:val="0"/>
+              </w:rPr>
+              <w:t xml:space="preserve">${nbPostgraduateInterns}</w:t>
+            </w:r>
+            <w:r>
+              <w:rPr>
+                <w:rtl w:val="0"/>
+              </w:rPr>
             </w:r>
           </w:p>
           <w:p>
@@ -9283,32 +9340,87 @@
               <w:spacing w:after="0" w:before="0" w:line="240" w:lineRule="auto"/>
               <w:ind w:left="720" w:right="0" w:hanging="360"/>
               <w:rPr>
-                <w:i w:val="0"/>
-                <w:iCs w:val="0"/>
-                <w:smallCaps w:val="0"/>
-                <w:strike w:val="0"/>
-                <w:color w:val="000000"/>
                 <w:sz w:val="20"/>
                 <w:szCs w:val="20"/>
-                <w:shd w:fill="auto" w:val="clear"/>
-                <w:vertAlign w:val="baseline"/>
+                <w:u w:val="none"/>
               </w:rPr>
             </w:pPr>
             <w:r>
               <w:rPr>
-                <w:i w:val="0"/>
-                <w:iCs w:val="0"/>
-                <w:smallCaps w:val="0"/>
-                <w:strike w:val="0"/>
-                <w:color w:val="000000"/>
                 <w:sz w:val="20"/>
                 <w:szCs w:val="20"/>
-                <w:u w:val="none"/>
-                <w:shd w:fill="auto" w:val="clear"/>
-                <w:vertAlign w:val="baseline"/>
-                <w:rtl w:val="0"/>
-              </w:rPr>
-              <w:t xml:space="preserve">Étrangers :   /</w:t>
+                <w:rtl w:val="0"/>
+              </w:rPr>
+              <w:t xml:space="preserve">Lycées : ${nbHighSchoolInterns}</w:t>
+            </w:r>
+          </w:p>
+          <w:p>
+            <w:pPr>
+              <w:keepNext w:val="0"/>
+              <w:keepLines w:val="0"/>
+              <w:widowControl w:val="0"/>
+              <w:numPr>
+                <w:ilvl w:val="0"/>
+                <w:numId w:val="1"/>
+              </w:numPr>
+              <w:pBdr>
+                <w:top w:space="0" w:sz="0" w:val="nil"/>
+                <w:left w:space="0" w:sz="0" w:val="nil"/>
+                <w:bottom w:space="0" w:sz="0" w:val="nil"/>
+                <w:right w:space="0" w:sz="0" w:val="nil"/>
+                <w:between w:space="0" w:sz="0" w:val="nil"/>
+              </w:pBdr>
+              <w:shd w:fill="auto" w:val="clear"/>
+              <w:spacing w:after="0" w:before="0" w:line="240" w:lineRule="auto"/>
+              <w:ind w:left="720" w:right="0" w:hanging="360"/>
+              <w:rPr>
+                <w:i w:val="0"/>
+                <w:iCs w:val="0"/>
+                <w:smallCaps w:val="0"/>
+                <w:strike w:val="0"/>
+                <w:color w:val="000000"/>
+                <w:sz w:val="20"/>
+                <w:szCs w:val="20"/>
+                <w:shd w:fill="auto" w:val="clear"/>
+                <w:vertAlign w:val="baseline"/>
+              </w:rPr>
+            </w:pPr>
+            <w:r>
+              <w:rPr>
+                <w:sz w:val="20"/>
+                <w:szCs w:val="20"/>
+                <w:rtl w:val="0"/>
+              </w:rPr>
+              <w:t xml:space="preserve">Autres</w:t>
+            </w:r>
+            <w:r>
+              <w:rPr>
+                <w:i w:val="0"/>
+                <w:iCs w:val="0"/>
+                <w:smallCaps w:val="0"/>
+                <w:strike w:val="0"/>
+                <w:color w:val="000000"/>
+                <w:sz w:val="20"/>
+                <w:szCs w:val="20"/>
+                <w:u w:val="none"/>
+                <w:shd w:fill="auto" w:val="clear"/>
+                <w:vertAlign w:val="baseline"/>
+                <w:rtl w:val="0"/>
+              </w:rPr>
+              <w:t xml:space="preserve"> : </w:t>
+            </w:r>
+            <w:r>
+              <w:rPr>
+                <w:sz w:val="20"/>
+                <w:szCs w:val="20"/>
+                <w:rtl w:val="0"/>
+              </w:rPr>
+              <w:t xml:space="preserve">${nbOtherInterns}</w:t>
+            </w:r>
+            <w:r>
+              <w:rPr>
+                <w:rtl w:val="0"/>
+              </w:rPr>
             </w:r>
           </w:p>
         </w:tc>
@@ -9365,7 +9477,20 @@
                 <w:vertAlign w:val="baseline"/>
                 <w:rtl w:val="0"/>
               </w:rPr>
-              <w:t xml:space="preserve">Total de jours/stagiaires : /</w:t>
+              <w:t xml:space="preserve">Total de jours/stagiaires : </w:t>
+            </w:r>
+            <w:r>
+              <w:rPr>
+                <w:sz w:val="20"/>
+                <w:szCs w:val="20"/>
+                <w:rtl w:val="0"/>
+              </w:rPr>
+              <w:t xml:space="preserve">${totalInternDurationInDays}</w:t>
+            </w:r>
+            <w:r>
+              <w:rPr>
+                <w:rtl w:val="0"/>
+              </w:rPr>
             </w:r>
           </w:p>
         </w:tc>

</xml_diff>